<commit_message>
feat: preparar distribucion multiplataforma y actualizar interfaz Santoto Tunja
</commit_message>
<xml_diff>
--- a/templates/PLANTILLA_INFORME.docx
+++ b/templates/PLANTILLA_INFORME.docx
@@ -569,8 +569,7 @@
       </w:pPr>
       <w:bookmarkStart w:id="0" w:name="_Toc109393327"/>
       <w:r>
-        <w:lastRenderedPageBreak/>
-        <w:t>Resumen Ejecutivo</w:t>
+        <w:t>Resumen del informe</w:t>
       </w:r>
       <w:bookmarkEnd w:id="0"/>
     </w:p>
@@ -587,7 +586,7 @@
         <w:pStyle w:val="Ttulo1"/>
       </w:pPr>
       <w:r>
-        <w:t>Indicadores principales</w:t>
+        <w:t>Cifras principales</w:t>
       </w:r>
     </w:p>
     <w:tbl>
@@ -874,7 +873,7 @@
         <w:jc w:val="both"/>
       </w:pPr>
       <w:r>
-        <w:t>Para los estudiantes, la información se calculó con respecto a la cantidad de días al mes que usaron sus respectivos cursos virtuales y la cantidad promedio de estudiantes por curso que interactuaron con la plataforma. Cada análisis del informe esta soportado por una o un grupo de gráficas estadísticas para facilitar la interpretación de los datos.</w:t>
+        <w:t>Para conocer el uso de la plataforma por los estudiantes, se revisó cuántos días al mes tuvieron actividad en sus cursos y cuántos estudiantes participaron, en promedio, en cada curso. Las tablas y gráficas ayudan a comparar los resultados.</w:t>
       </w:r>
     </w:p>
     <w:p>
@@ -884,7 +883,7 @@
         <w:pageBreakBefore/>
       </w:pPr>
       <w:r>
-        <w:t>2. Metodología de los indicadores</w:t>
+        <w:t>2. Cómo leer los resultados</w:t>
       </w:r>
     </w:p>
     <w:tbl>
@@ -913,7 +912,7 @@
                 <w:color w:val="FFFFFF"/>
                 <w:sz w:val="17"/>
               </w:rPr>
-              <w:t>Concepto</w:t>
+              <w:t>Término</w:t>
             </w:r>
           </w:p>
         </w:tc>
@@ -929,7 +928,7 @@
                 <w:color w:val="FFFFFF"/>
                 <w:sz w:val="17"/>
               </w:rPr>
-              <w:t>Definición</w:t>
+              <w:t>Qué significa</w:t>
             </w:r>
           </w:p>
         </w:tc>
@@ -947,7 +946,7 @@
               <w:rPr>
                 <w:sz w:val="16"/>
               </w:rPr>
-              <w:t>Evento</w:t>
+              <w:t>Acción registrada</w:t>
             </w:r>
           </w:p>
         </w:tc>
@@ -960,7 +959,7 @@
               <w:rPr>
                 <w:sz w:val="16"/>
               </w:rPr>
-              <w:t>Acción individual almacenada en el registro de Open LMS.</w:t>
+              <w:t>Cada acción que queda guardada en el registro del Campus Virtual. Una persona puede realizar varias acciones en un mismo ingreso.</w:t>
             </w:r>
           </w:p>
         </w:tc>
@@ -979,7 +978,7 @@
               <w:rPr>
                 <w:sz w:val="16"/>
               </w:rPr>
-              <w:t>Usuario único</w:t>
+              <w:t>Persona contada una sola vez</w:t>
             </w:r>
           </w:p>
         </w:tc>
@@ -993,7 +992,7 @@
               <w:rPr>
                 <w:sz w:val="16"/>
               </w:rPr>
-              <w:t>Persona diferente identificada en el conjunto de datos.</w:t>
+              <w:t>Cada persona se cuenta una sola vez en el grupo y periodo que se están revisando, aunque haya usado la plataforma varias veces.</w:t>
             </w:r>
           </w:p>
         </w:tc>
@@ -1011,7 +1010,7 @@
               <w:rPr>
                 <w:sz w:val="16"/>
               </w:rPr>
-              <w:t>Día activo</w:t>
+              <w:t>Día con actividad</w:t>
             </w:r>
           </w:p>
         </w:tc>
@@ -1024,7 +1023,7 @@
               <w:rPr>
                 <w:sz w:val="16"/>
               </w:rPr>
-              <w:t>Fecha en la que un usuario o curso registró al menos un evento.</w:t>
+              <w:t>Día en el que se registró al menos una acción de una persona o en un curso. No indica las horas de conexión.</w:t>
             </w:r>
           </w:p>
         </w:tc>
@@ -1043,7 +1042,7 @@
               <w:rPr>
                 <w:sz w:val="16"/>
               </w:rPr>
-              <w:t>Usuario-mes</w:t>
+              <w:t>Persona contada por mes</w:t>
             </w:r>
           </w:p>
         </w:tc>
@@ -1057,7 +1056,7 @@
               <w:rPr>
                 <w:sz w:val="16"/>
               </w:rPr>
-              <w:t>Usuario contado una vez en cada mes con actividad; puede repetirse entre meses.</w:t>
+              <w:t>Una persona se cuenta una vez en cada mes en que tuvo actividad. Si participó en varios meses, aparecerá en el conteo de cada uno.</w:t>
             </w:r>
           </w:p>
         </w:tc>
@@ -1162,7 +1161,7 @@
         <w:pageBreakBefore/>
       </w:pPr>
       <w:r>
-        <w:t>3. Comportamiento mensual de la actividad</w:t>
+        <w:t>3. Uso de la plataforma por mes</w:t>
       </w:r>
     </w:p>
     <w:p>
@@ -1656,7 +1655,7 @@
     </w:p>
     <w:p>
       <w:r>
-        <w:t>Los cursos con mayor continuidad docente acumulada se presentan a continuación:</w:t>
+        <w:t>La siguiente tabla muestra los cursos en los que los docentes registraron actividad durante más días:</w:t>
       </w:r>
     </w:p>
     <w:tbl>
@@ -2183,7 +2182,7 @@
     </w:p>
     <w:p>
       <w:r>
-        <w:t>La comparación se presenta por días activos para identificar los cursos con mayor continuidad estudiantil. Los eventos y estudiantes únicos se mantienen como indicadores complementarios.</w:t>
+        <w:t>Los cursos se ordenan según la cantidad de días en que hubo actividad de estudiantes. También se muestra cuántas acciones se registraron y cuántos estudiantes participaron, contando a cada persona una sola vez dentro de cada curso.</w:t>
       </w:r>
     </w:p>
     <w:p>

</xml_diff>